<commit_message>
Sync site copy with kit v1.2 contents, refresh free sample, standardize AIVIA
Co-Authored-By: Claude Fable 5 <noreply@anthropic.com>
</commit_message>
<xml_diff>
--- a/public/downloads/airegready-free-sample-ai-use-inventory.docx
+++ b/public/downloads/airegready-free-sample-ai-use-inventory.docx
@@ -12,67 +12,71 @@
     </w:p>
     <w:p>
       <w:r>
-        <w:t>Company: [COMPANY NAME]</w:t>
+        <w:rPr>
+          <w:b/>
+        </w:rPr>
+        <w:t>Company:</w:t>
+      </w:r>
+      <w:r>
+        <w:rPr/>
+        <w:t xml:space="preserve"> [COMPANY NAME]</w:t>
       </w:r>
     </w:p>
     <w:p>
       <w:r>
-        <w:t>Inventory owner: [AI GOVERNANCE LEAD]</w:t>
+        <w:rPr>
+          <w:b/>
+        </w:rPr>
+        <w:t>Inventory owner:</w:t>
+      </w:r>
+      <w:r>
+        <w:rPr/>
+        <w:t xml:space="preserve"> [AI GOVERNANCE LEAD]</w:t>
       </w:r>
     </w:p>
     <w:p>
       <w:r>
-        <w:t xml:space="preserve">Last reviewed: </w:t>
+        <w:rPr>
+          <w:b/>
+        </w:rPr>
+        <w:t>Last reviewed:</w:t>
+      </w:r>
+      <w:r>
+        <w:rPr/>
+        <w:t xml:space="preserve"> </w:t>
       </w:r>
     </w:p>
     <w:p>
       <w:r>
-        <w:t>Review cadence: Quarterly</w:t>
+        <w:rPr>
+          <w:b/>
+        </w:rPr>
+        <w:t>Review cadence:</w:t>
+      </w:r>
+      <w:r>
+        <w:rPr/>
+        <w:t xml:space="preserve"> Quarterly</w:t>
       </w:r>
     </w:p>
     <w:p>
       <w:pPr>
-        <w:spacing w:before="60"/>
         <w:ind w:left="360"/>
       </w:pPr>
       <w:r>
         <w:rPr>
           <w:rFonts w:ascii="Arial" w:hAnsi="Arial"/>
+          <w:b/>
           <w:i/>
         </w:rPr>
-        <w:t>How to use. This is the master record of every AI tool, workflow, and system in use at [COMPANY NAME]. Keep it current. Under state AI laws such as Colorado SB 26-189, the EU AI Act, NIST AI RMF, and most enterprise audit frameworks, a current inventory is foundational - it's the first thing a regulator or customer will ask for.</w:t>
+        <w:t>How to use.</w:t>
       </w:r>
-    </w:p>
-    <w:p>
-      <w:pPr>
-        <w:spacing w:before="60"/>
-        <w:ind w:left="360"/>
-      </w:pPr>
       <w:r>
         <w:rPr>
           <w:rFonts w:ascii="Arial" w:hAnsi="Arial"/>
           <w:i/>
         </w:rPr>
+        <w:t xml:space="preserve"> This is the master record of every AI tool, workflow, and system in use at [COMPANY NAME]. Keep it current. Under AI laws and frameworks such as Colorado SB 26-189, the EU AI Act, the NIST AI RMF, and most enterprise audit expectations, a current inventory is foundational - it's the first thing a regulator or customer will ask for. In practice: keep this as a spreadsheet (Google Sheet / Airtable / Excel) and use this document as the field schema. The fields below match the columns of the spreadsheet.</w:t>
       </w:r>
-    </w:p>
-    <w:p>
-      <w:pPr>
-        <w:spacing w:before="60"/>
-        <w:ind w:left="360"/>
-      </w:pPr>
-      <w:r>
-        <w:rPr>
-          <w:rFonts w:ascii="Arial" w:hAnsi="Arial"/>
-          <w:i/>
-        </w:rPr>
-        <w:t>In practice: keep this as a spreadsheet (Google Sheet / Airtable / Excel) and use this document as the field schema. The fields below match the columns of the spreadsheet.</w:t>
-      </w:r>
-    </w:p>
-    <w:p>
-      <w:pPr>
-        <w:spacing w:before="60" w:after="60"/>
-      </w:pPr>
-      <w:r/>
     </w:p>
     <w:p>
       <w:pPr>
@@ -84,6 +88,7 @@
     </w:p>
     <w:p>
       <w:r>
+        <w:rPr/>
         <w:t>List it if any of these are true:</w:t>
       </w:r>
     </w:p>
@@ -92,6 +97,7 @@
         <w:pStyle w:val="ListBullet"/>
       </w:pPr>
       <w:r>
+        <w:rPr/>
         <w:t>It uses machine learning or generative AI to produce text, code, images, audio, video, decisions, recommendations, or scores</w:t>
       </w:r>
     </w:p>
@@ -100,6 +106,7 @@
         <w:pStyle w:val="ListBullet"/>
       </w:pPr>
       <w:r>
+        <w:rPr/>
         <w:t>It's a third-party product that has AI features turned on (even if AI isn't the main purpose)</w:t>
       </w:r>
     </w:p>
@@ -108,6 +115,7 @@
         <w:pStyle w:val="ListBullet"/>
       </w:pPr>
       <w:r>
+        <w:rPr/>
         <w:t>It's a custom integration that calls an AI model's API</w:t>
       </w:r>
     </w:p>
@@ -116,24 +124,31 @@
         <w:pStyle w:val="ListBullet"/>
       </w:pPr>
       <w:r>
+        <w:rPr/>
         <w:t>A team member uses their personal account on an AI tool for work</w:t>
       </w:r>
     </w:p>
     <w:p>
       <w:r>
-        <w:t>Do not list systems that have no AI component (classic rule-based software, spreadsheets, databases, calculators).</w:t>
+        <w:rPr/>
+        <w:t xml:space="preserve">Do </w:t>
+      </w:r>
+      <w:r>
+        <w:rPr>
+          <w:b/>
+        </w:rPr>
+        <w:t>not</w:t>
+      </w:r>
+      <w:r>
+        <w:rPr/>
+        <w:t xml:space="preserve"> list systems that have no AI component (classic rule-based software, spreadsheets, databases, calculators).</w:t>
       </w:r>
     </w:p>
     <w:p>
       <w:r>
+        <w:rPr/>
         <w:t>If you're not sure: list it and mark the AI role as "uncertain - to classify."</w:t>
       </w:r>
-    </w:p>
-    <w:p>
-      <w:pPr>
-        <w:spacing w:before="60" w:after="60"/>
-      </w:pPr>
-      <w:r/>
     </w:p>
     <w:p>
       <w:pPr>
@@ -243,6 +258,7 @@
             <w:r>
               <w:rPr>
                 <w:rFonts w:ascii="Arial" w:hAnsi="Arial"/>
+                <w:b/>
                 <w:sz w:val="18"/>
               </w:rPr>
               <w:t>ID</w:t>
@@ -293,6 +309,7 @@
             <w:r>
               <w:rPr>
                 <w:rFonts w:ascii="Arial" w:hAnsi="Arial"/>
+                <w:b/>
                 <w:sz w:val="18"/>
               </w:rPr>
               <w:t>Name</w:t>
@@ -343,6 +360,7 @@
             <w:r>
               <w:rPr>
                 <w:rFonts w:ascii="Arial" w:hAnsi="Arial"/>
+                <w:b/>
                 <w:sz w:val="18"/>
               </w:rPr>
               <w:t>Description</w:t>
@@ -393,6 +411,7 @@
             <w:r>
               <w:rPr>
                 <w:rFonts w:ascii="Arial" w:hAnsi="Arial"/>
+                <w:b/>
                 <w:sz w:val="18"/>
               </w:rPr>
               <w:t>Vendor</w:t>
@@ -443,6 +462,7 @@
             <w:r>
               <w:rPr>
                 <w:rFonts w:ascii="Arial" w:hAnsi="Arial"/>
+                <w:b/>
                 <w:sz w:val="18"/>
               </w:rPr>
               <w:t>Product / model name</w:t>
@@ -493,6 +513,7 @@
             <w:r>
               <w:rPr>
                 <w:rFonts w:ascii="Arial" w:hAnsi="Arial"/>
+                <w:b/>
                 <w:sz w:val="18"/>
               </w:rPr>
               <w:t>Version / release</w:t>
@@ -543,6 +564,7 @@
             <w:r>
               <w:rPr>
                 <w:rFonts w:ascii="Arial" w:hAnsi="Arial"/>
+                <w:b/>
                 <w:sz w:val="18"/>
               </w:rPr>
               <w:t>Environment</w:t>
@@ -676,6 +698,7 @@
             <w:r>
               <w:rPr>
                 <w:rFonts w:ascii="Arial" w:hAnsi="Arial"/>
+                <w:b/>
                 <w:sz w:val="18"/>
               </w:rPr>
               <w:t>Business owner</w:t>
@@ -726,6 +749,7 @@
             <w:r>
               <w:rPr>
                 <w:rFonts w:ascii="Arial" w:hAnsi="Arial"/>
+                <w:b/>
                 <w:sz w:val="18"/>
               </w:rPr>
               <w:t>Business owner email</w:t>
@@ -776,6 +800,7 @@
             <w:r>
               <w:rPr>
                 <w:rFonts w:ascii="Arial" w:hAnsi="Arial"/>
+                <w:b/>
                 <w:sz w:val="18"/>
               </w:rPr>
               <w:t>Department / team</w:t>
@@ -826,6 +851,7 @@
             <w:r>
               <w:rPr>
                 <w:rFonts w:ascii="Arial" w:hAnsi="Arial"/>
+                <w:b/>
                 <w:sz w:val="18"/>
               </w:rPr>
               <w:t>Technical owner</w:t>
@@ -876,6 +902,7 @@
             <w:r>
               <w:rPr>
                 <w:rFonts w:ascii="Arial" w:hAnsi="Arial"/>
+                <w:b/>
                 <w:sz w:val="18"/>
               </w:rPr>
               <w:t>Added by</w:t>
@@ -926,6 +953,7 @@
             <w:r>
               <w:rPr>
                 <w:rFonts w:ascii="Arial" w:hAnsi="Arial"/>
+                <w:b/>
                 <w:sz w:val="18"/>
               </w:rPr>
               <w:t>Date added</w:t>
@@ -976,6 +1004,7 @@
             <w:r>
               <w:rPr>
                 <w:rFonts w:ascii="Arial" w:hAnsi="Arial"/>
+                <w:b/>
                 <w:sz w:val="18"/>
               </w:rPr>
               <w:t>Last reviewed</w:t>
@@ -1026,6 +1055,7 @@
             <w:r>
               <w:rPr>
                 <w:rFonts w:ascii="Arial" w:hAnsi="Arial"/>
+                <w:b/>
                 <w:sz w:val="18"/>
               </w:rPr>
               <w:t>Next review due</w:t>
@@ -1159,6 +1189,7 @@
             <w:r>
               <w:rPr>
                 <w:rFonts w:ascii="Arial" w:hAnsi="Arial"/>
+                <w:b/>
                 <w:sz w:val="18"/>
               </w:rPr>
               <w:t>Primary use case</w:t>
@@ -1209,6 +1240,7 @@
             <w:r>
               <w:rPr>
                 <w:rFonts w:ascii="Arial" w:hAnsi="Arial"/>
+                <w:b/>
                 <w:sz w:val="18"/>
               </w:rPr>
               <w:t>User population</w:t>
@@ -1259,6 +1291,7 @@
             <w:r>
               <w:rPr>
                 <w:rFonts w:ascii="Arial" w:hAnsi="Arial"/>
+                <w:b/>
                 <w:sz w:val="18"/>
               </w:rPr>
               <w:t>Approximate monthly volume</w:t>
@@ -1309,6 +1342,7 @@
             <w:r>
               <w:rPr>
                 <w:rFonts w:ascii="Arial" w:hAnsi="Arial"/>
+                <w:b/>
                 <w:sz w:val="18"/>
               </w:rPr>
               <w:t>Is a substantial factor in a consequential decision?</w:t>
@@ -1359,6 +1393,7 @@
             <w:r>
               <w:rPr>
                 <w:rFonts w:ascii="Arial" w:hAnsi="Arial"/>
+                <w:b/>
                 <w:sz w:val="18"/>
               </w:rPr>
               <w:t>Which consequential-decision category?</w:t>
@@ -1409,6 +1444,7 @@
             <w:r>
               <w:rPr>
                 <w:rFonts w:ascii="Arial" w:hAnsi="Arial"/>
+                <w:b/>
                 <w:sz w:val="18"/>
               </w:rPr>
               <w:t>Customer-facing?</w:t>
@@ -1542,6 +1578,7 @@
             <w:r>
               <w:rPr>
                 <w:rFonts w:ascii="Arial" w:hAnsi="Arial"/>
+                <w:b/>
                 <w:sz w:val="18"/>
               </w:rPr>
               <w:t>Data inputs</w:t>
@@ -1592,6 +1629,7 @@
             <w:r>
               <w:rPr>
                 <w:rFonts w:ascii="Arial" w:hAnsi="Arial"/>
+                <w:b/>
                 <w:sz w:val="18"/>
               </w:rPr>
               <w:t>Contains personal data?</w:t>
@@ -1642,6 +1680,7 @@
             <w:r>
               <w:rPr>
                 <w:rFonts w:ascii="Arial" w:hAnsi="Arial"/>
+                <w:b/>
                 <w:sz w:val="18"/>
               </w:rPr>
               <w:t>Contains sensitive personal data?</w:t>
@@ -1692,6 +1731,7 @@
             <w:r>
               <w:rPr>
                 <w:rFonts w:ascii="Arial" w:hAnsi="Arial"/>
+                <w:b/>
                 <w:sz w:val="18"/>
               </w:rPr>
               <w:t>Contains confidential business data?</w:t>
@@ -1742,6 +1782,7 @@
             <w:r>
               <w:rPr>
                 <w:rFonts w:ascii="Arial" w:hAnsi="Arial"/>
+                <w:b/>
                 <w:sz w:val="18"/>
               </w:rPr>
               <w:t>Data retention at vendor</w:t>
@@ -1792,6 +1833,7 @@
             <w:r>
               <w:rPr>
                 <w:rFonts w:ascii="Arial" w:hAnsi="Arial"/>
+                <w:b/>
                 <w:sz w:val="18"/>
               </w:rPr>
               <w:t>Used for training?</w:t>
@@ -1842,6 +1884,7 @@
             <w:r>
               <w:rPr>
                 <w:rFonts w:ascii="Arial" w:hAnsi="Arial"/>
+                <w:b/>
                 <w:sz w:val="18"/>
               </w:rPr>
               <w:t>Data residency</w:t>
@@ -1975,6 +2018,7 @@
             <w:r>
               <w:rPr>
                 <w:rFonts w:ascii="Arial" w:hAnsi="Arial"/>
+                <w:b/>
                 <w:sz w:val="18"/>
               </w:rPr>
               <w:t>Tier</w:t>
@@ -2025,6 +2069,7 @@
             <w:r>
               <w:rPr>
                 <w:rFonts w:ascii="Arial" w:hAnsi="Arial"/>
+                <w:b/>
                 <w:sz w:val="18"/>
               </w:rPr>
               <w:t>Colorado covered ADMT?</w:t>
@@ -2075,6 +2120,7 @@
             <w:r>
               <w:rPr>
                 <w:rFonts w:ascii="Arial" w:hAnsi="Arial"/>
+                <w:b/>
                 <w:sz w:val="18"/>
               </w:rPr>
               <w:t>EU AI Act classification</w:t>
@@ -2125,6 +2171,7 @@
             <w:r>
               <w:rPr>
                 <w:rFonts w:ascii="Arial" w:hAnsi="Arial"/>
+                <w:b/>
                 <w:sz w:val="18"/>
               </w:rPr>
               <w:t>EU role</w:t>
@@ -2175,6 +2222,7 @@
             <w:r>
               <w:rPr>
                 <w:rFonts w:ascii="Arial" w:hAnsi="Arial"/>
+                <w:b/>
                 <w:sz w:val="18"/>
               </w:rPr>
               <w:t>Other applicable laws</w:t>
@@ -2225,6 +2273,7 @@
             <w:r>
               <w:rPr>
                 <w:rFonts w:ascii="Arial" w:hAnsi="Arial"/>
+                <w:b/>
                 <w:sz w:val="18"/>
               </w:rPr>
               <w:t>Impact assessment on file?</w:t>
@@ -2275,6 +2324,7 @@
             <w:r>
               <w:rPr>
                 <w:rFonts w:ascii="Arial" w:hAnsi="Arial"/>
+                <w:b/>
                 <w:sz w:val="18"/>
               </w:rPr>
               <w:t>Impact assessment date</w:t>
@@ -2325,6 +2375,7 @@
             <w:r>
               <w:rPr>
                 <w:rFonts w:ascii="Arial" w:hAnsi="Arial"/>
+                <w:b/>
                 <w:sz w:val="18"/>
               </w:rPr>
               <w:t>Next assessment due</w:t>
@@ -2458,6 +2509,7 @@
             <w:r>
               <w:rPr>
                 <w:rFonts w:ascii="Arial" w:hAnsi="Arial"/>
+                <w:b/>
                 <w:sz w:val="18"/>
               </w:rPr>
               <w:t>Human in the loop?</w:t>
@@ -2508,6 +2560,7 @@
             <w:r>
               <w:rPr>
                 <w:rFonts w:ascii="Arial" w:hAnsi="Arial"/>
+                <w:b/>
                 <w:sz w:val="18"/>
               </w:rPr>
               <w:t>Override possible?</w:t>
@@ -2558,6 +2611,7 @@
             <w:r>
               <w:rPr>
                 <w:rFonts w:ascii="Arial" w:hAnsi="Arial"/>
+                <w:b/>
                 <w:sz w:val="18"/>
               </w:rPr>
               <w:t>Logging enabled?</w:t>
@@ -2608,6 +2662,7 @@
             <w:r>
               <w:rPr>
                 <w:rFonts w:ascii="Arial" w:hAnsi="Arial"/>
+                <w:b/>
                 <w:sz w:val="18"/>
               </w:rPr>
               <w:t>Log retention</w:t>
@@ -2658,6 +2713,7 @@
             <w:r>
               <w:rPr>
                 <w:rFonts w:ascii="Arial" w:hAnsi="Arial"/>
+                <w:b/>
                 <w:sz w:val="18"/>
               </w:rPr>
               <w:t>SSO / MFA enforced?</w:t>
@@ -2708,6 +2764,7 @@
             <w:r>
               <w:rPr>
                 <w:rFonts w:ascii="Arial" w:hAnsi="Arial"/>
+                <w:b/>
                 <w:sz w:val="18"/>
               </w:rPr>
               <w:t>DPA signed?</w:t>
@@ -2758,6 +2815,7 @@
             <w:r>
               <w:rPr>
                 <w:rFonts w:ascii="Arial" w:hAnsi="Arial"/>
+                <w:b/>
                 <w:sz w:val="18"/>
               </w:rPr>
               <w:t>BAA signed?</w:t>
@@ -2808,6 +2866,7 @@
             <w:r>
               <w:rPr>
                 <w:rFonts w:ascii="Arial" w:hAnsi="Arial"/>
+                <w:b/>
                 <w:sz w:val="18"/>
               </w:rPr>
               <w:t>SCCs signed?</w:t>
@@ -2858,6 +2917,7 @@
             <w:r>
               <w:rPr>
                 <w:rFonts w:ascii="Arial" w:hAnsi="Arial"/>
+                <w:b/>
                 <w:sz w:val="18"/>
               </w:rPr>
               <w:t>Vendor SOC 2 / ISO 27001?</w:t>
@@ -2991,6 +3051,7 @@
             <w:r>
               <w:rPr>
                 <w:rFonts w:ascii="Arial" w:hAnsi="Arial"/>
+                <w:b/>
                 <w:sz w:val="18"/>
               </w:rPr>
               <w:t>Disclosure to users?</w:t>
@@ -3041,6 +3102,7 @@
             <w:r>
               <w:rPr>
                 <w:rFonts w:ascii="Arial" w:hAnsi="Arial"/>
+                <w:b/>
                 <w:sz w:val="18"/>
               </w:rPr>
               <w:t>Disclosure location</w:t>
@@ -3091,6 +3153,7 @@
             <w:r>
               <w:rPr>
                 <w:rFonts w:ascii="Arial" w:hAnsi="Arial"/>
+                <w:b/>
                 <w:sz w:val="18"/>
               </w:rPr>
               <w:t>Opt-out available?</w:t>
@@ -3141,6 +3204,7 @@
             <w:r>
               <w:rPr>
                 <w:rFonts w:ascii="Arial" w:hAnsi="Arial"/>
+                <w:b/>
                 <w:sz w:val="18"/>
               </w:rPr>
               <w:t>Appeal path available?</w:t>
@@ -3274,6 +3338,7 @@
             <w:r>
               <w:rPr>
                 <w:rFonts w:ascii="Arial" w:hAnsi="Arial"/>
+                <w:b/>
                 <w:sz w:val="18"/>
               </w:rPr>
               <w:t>Status</w:t>
@@ -3324,6 +3389,7 @@
             <w:r>
               <w:rPr>
                 <w:rFonts w:ascii="Arial" w:hAnsi="Arial"/>
+                <w:b/>
                 <w:sz w:val="18"/>
               </w:rPr>
               <w:t>Approval source</w:t>
@@ -3374,6 +3440,7 @@
             <w:r>
               <w:rPr>
                 <w:rFonts w:ascii="Arial" w:hAnsi="Arial"/>
+                <w:b/>
                 <w:sz w:val="18"/>
               </w:rPr>
               <w:t>Approval date</w:t>
@@ -3424,6 +3491,7 @@
             <w:r>
               <w:rPr>
                 <w:rFonts w:ascii="Arial" w:hAnsi="Arial"/>
+                <w:b/>
                 <w:sz w:val="18"/>
               </w:rPr>
               <w:t>Retirement date</w:t>
@@ -3474,6 +3542,7 @@
             <w:r>
               <w:rPr>
                 <w:rFonts w:ascii="Arial" w:hAnsi="Arial"/>
+                <w:b/>
                 <w:sz w:val="18"/>
               </w:rPr>
               <w:t>Open actions</w:t>
@@ -3524,6 +3593,7 @@
             <w:r>
               <w:rPr>
                 <w:rFonts w:ascii="Arial" w:hAnsi="Arial"/>
+                <w:b/>
                 <w:sz w:val="18"/>
               </w:rPr>
               <w:t>Incident history</w:t>
@@ -3559,12 +3629,6 @@
     <w:p/>
     <w:p>
       <w:pPr>
-        <w:spacing w:before="60" w:after="60"/>
-      </w:pPr>
-      <w:r/>
-    </w:p>
-    <w:p>
-      <w:pPr>
         <w:pStyle w:val="Heading2"/>
       </w:pPr>
       <w:r>
@@ -3573,6 +3637,7 @@
     </w:p>
     <w:p>
       <w:r>
+        <w:rPr/>
         <w:t>Delete these and replace with your actual systems.</w:t>
       </w:r>
     </w:p>
@@ -3622,7 +3687,7 @@
               <w:rPr>
                 <w:rFonts w:ascii="Arial" w:hAnsi="Arial"/>
                 <w:b/>
-                <w:sz w:val="16"/>
+                <w:sz w:val="18"/>
               </w:rPr>
               <w:t>ID</w:t>
             </w:r>
@@ -3648,7 +3713,7 @@
               <w:rPr>
                 <w:rFonts w:ascii="Arial" w:hAnsi="Arial"/>
                 <w:b/>
-                <w:sz w:val="16"/>
+                <w:sz w:val="18"/>
               </w:rPr>
               <w:t>Name</w:t>
             </w:r>
@@ -3674,7 +3739,7 @@
               <w:rPr>
                 <w:rFonts w:ascii="Arial" w:hAnsi="Arial"/>
                 <w:b/>
-                <w:sz w:val="16"/>
+                <w:sz w:val="18"/>
               </w:rPr>
               <w:t>Vendor</w:t>
             </w:r>
@@ -3700,7 +3765,7 @@
               <w:rPr>
                 <w:rFonts w:ascii="Arial" w:hAnsi="Arial"/>
                 <w:b/>
-                <w:sz w:val="16"/>
+                <w:sz w:val="18"/>
               </w:rPr>
               <w:t>Business owner</w:t>
             </w:r>
@@ -3726,7 +3791,7 @@
               <w:rPr>
                 <w:rFonts w:ascii="Arial" w:hAnsi="Arial"/>
                 <w:b/>
-                <w:sz w:val="16"/>
+                <w:sz w:val="18"/>
               </w:rPr>
               <w:t>Tier</w:t>
             </w:r>
@@ -3752,7 +3817,7 @@
               <w:rPr>
                 <w:rFonts w:ascii="Arial" w:hAnsi="Arial"/>
                 <w:b/>
-                <w:sz w:val="16"/>
+                <w:sz w:val="18"/>
               </w:rPr>
               <w:t>EU classification</w:t>
             </w:r>
@@ -3778,7 +3843,7 @@
               <w:rPr>
                 <w:rFonts w:ascii="Arial" w:hAnsi="Arial"/>
                 <w:b/>
-                <w:sz w:val="16"/>
+                <w:sz w:val="18"/>
               </w:rPr>
               <w:t>Colorado covered ADMT</w:t>
             </w:r>
@@ -3804,7 +3869,7 @@
               <w:rPr>
                 <w:rFonts w:ascii="Arial" w:hAnsi="Arial"/>
                 <w:b/>
-                <w:sz w:val="16"/>
+                <w:sz w:val="18"/>
               </w:rPr>
               <w:t>Status</w:t>
             </w:r>
@@ -3830,7 +3895,7 @@
             <w:r>
               <w:rPr>
                 <w:rFonts w:ascii="Arial" w:hAnsi="Arial"/>
-                <w:sz w:val="16"/>
+                <w:sz w:val="18"/>
               </w:rPr>
               <w:t>AIS-001</w:t>
             </w:r>
@@ -3854,7 +3919,7 @@
             <w:r>
               <w:rPr>
                 <w:rFonts w:ascii="Arial" w:hAnsi="Arial"/>
-                <w:sz w:val="16"/>
+                <w:sz w:val="18"/>
               </w:rPr>
               <w:t>Customer support chatbot</w:t>
             </w:r>
@@ -3878,7 +3943,7 @@
             <w:r>
               <w:rPr>
                 <w:rFonts w:ascii="Arial" w:hAnsi="Arial"/>
-                <w:sz w:val="16"/>
+                <w:sz w:val="18"/>
               </w:rPr>
               <w:t>[VENDOR]</w:t>
             </w:r>
@@ -3902,7 +3967,7 @@
             <w:r>
               <w:rPr>
                 <w:rFonts w:ascii="Arial" w:hAnsi="Arial"/>
-                <w:sz w:val="16"/>
+                <w:sz w:val="18"/>
               </w:rPr>
               <w:t>[NAME]</w:t>
             </w:r>
@@ -3926,7 +3991,7 @@
             <w:r>
               <w:rPr>
                 <w:rFonts w:ascii="Arial" w:hAnsi="Arial"/>
-                <w:sz w:val="16"/>
+                <w:sz w:val="18"/>
               </w:rPr>
               <w:t>Tier 2</w:t>
             </w:r>
@@ -3950,7 +4015,7 @@
             <w:r>
               <w:rPr>
                 <w:rFonts w:ascii="Arial" w:hAnsi="Arial"/>
-                <w:sz w:val="16"/>
+                <w:sz w:val="18"/>
               </w:rPr>
               <w:t>Limited-risk (Art 50)</w:t>
             </w:r>
@@ -3974,7 +4039,7 @@
             <w:r>
               <w:rPr>
                 <w:rFonts w:ascii="Arial" w:hAnsi="Arial"/>
-                <w:sz w:val="16"/>
+                <w:sz w:val="18"/>
               </w:rPr>
               <w:t>No</w:t>
             </w:r>
@@ -3998,7 +4063,7 @@
             <w:r>
               <w:rPr>
                 <w:rFonts w:ascii="Arial" w:hAnsi="Arial"/>
-                <w:sz w:val="16"/>
+                <w:sz w:val="18"/>
               </w:rPr>
               <w:t>In production</w:t>
             </w:r>
@@ -4024,7 +4089,7 @@
             <w:r>
               <w:rPr>
                 <w:rFonts w:ascii="Arial" w:hAnsi="Arial"/>
-                <w:sz w:val="16"/>
+                <w:sz w:val="18"/>
               </w:rPr>
               <w:t>AIS-002</w:t>
             </w:r>
@@ -4048,7 +4113,7 @@
             <w:r>
               <w:rPr>
                 <w:rFonts w:ascii="Arial" w:hAnsi="Arial"/>
-                <w:sz w:val="16"/>
+                <w:sz w:val="18"/>
               </w:rPr>
               <w:t>Resume screener</w:t>
             </w:r>
@@ -4072,7 +4137,7 @@
             <w:r>
               <w:rPr>
                 <w:rFonts w:ascii="Arial" w:hAnsi="Arial"/>
-                <w:sz w:val="16"/>
+                <w:sz w:val="18"/>
               </w:rPr>
               <w:t>[VENDOR]</w:t>
             </w:r>
@@ -4096,7 +4161,7 @@
             <w:r>
               <w:rPr>
                 <w:rFonts w:ascii="Arial" w:hAnsi="Arial"/>
-                <w:sz w:val="16"/>
+                <w:sz w:val="18"/>
               </w:rPr>
               <w:t>[HR LEAD]</w:t>
             </w:r>
@@ -4120,7 +4185,7 @@
             <w:r>
               <w:rPr>
                 <w:rFonts w:ascii="Arial" w:hAnsi="Arial"/>
-                <w:sz w:val="16"/>
+                <w:sz w:val="18"/>
               </w:rPr>
               <w:t>Tier 3</w:t>
             </w:r>
@@ -4144,7 +4209,7 @@
             <w:r>
               <w:rPr>
                 <w:rFonts w:ascii="Arial" w:hAnsi="Arial"/>
-                <w:sz w:val="16"/>
+                <w:sz w:val="18"/>
               </w:rPr>
               <w:t>High-risk (Annex III, employment)</w:t>
             </w:r>
@@ -4168,7 +4233,7 @@
             <w:r>
               <w:rPr>
                 <w:rFonts w:ascii="Arial" w:hAnsi="Arial"/>
-                <w:sz w:val="16"/>
+                <w:sz w:val="18"/>
               </w:rPr>
               <w:t>Yes</w:t>
             </w:r>
@@ -4192,7 +4257,7 @@
             <w:r>
               <w:rPr>
                 <w:rFonts w:ascii="Arial" w:hAnsi="Arial"/>
-                <w:sz w:val="16"/>
+                <w:sz w:val="18"/>
               </w:rPr>
               <w:t>Under review</w:t>
             </w:r>
@@ -4218,7 +4283,7 @@
             <w:r>
               <w:rPr>
                 <w:rFonts w:ascii="Arial" w:hAnsi="Arial"/>
-                <w:sz w:val="16"/>
+                <w:sz w:val="18"/>
               </w:rPr>
               <w:t>AIS-003</w:t>
             </w:r>
@@ -4242,7 +4307,7 @@
             <w:r>
               <w:rPr>
                 <w:rFonts w:ascii="Arial" w:hAnsi="Arial"/>
-                <w:sz w:val="16"/>
+                <w:sz w:val="18"/>
               </w:rPr>
               <w:t>Marketing copy assistant</w:t>
             </w:r>
@@ -4266,7 +4331,7 @@
             <w:r>
               <w:rPr>
                 <w:rFonts w:ascii="Arial" w:hAnsi="Arial"/>
-                <w:sz w:val="16"/>
+                <w:sz w:val="18"/>
               </w:rPr>
               <w:t>[VENDOR]</w:t>
             </w:r>
@@ -4290,7 +4355,7 @@
             <w:r>
               <w:rPr>
                 <w:rFonts w:ascii="Arial" w:hAnsi="Arial"/>
-                <w:sz w:val="16"/>
+                <w:sz w:val="18"/>
               </w:rPr>
               <w:t>[MARKETING LEAD]</w:t>
             </w:r>
@@ -4314,7 +4379,7 @@
             <w:r>
               <w:rPr>
                 <w:rFonts w:ascii="Arial" w:hAnsi="Arial"/>
-                <w:sz w:val="16"/>
+                <w:sz w:val="18"/>
               </w:rPr>
               <w:t>Tier 1</w:t>
             </w:r>
@@ -4338,7 +4403,7 @@
             <w:r>
               <w:rPr>
                 <w:rFonts w:ascii="Arial" w:hAnsi="Arial"/>
-                <w:sz w:val="16"/>
+                <w:sz w:val="18"/>
               </w:rPr>
               <w:t>Minimal-risk</w:t>
             </w:r>
@@ -4362,7 +4427,7 @@
             <w:r>
               <w:rPr>
                 <w:rFonts w:ascii="Arial" w:hAnsi="Arial"/>
-                <w:sz w:val="16"/>
+                <w:sz w:val="18"/>
               </w:rPr>
               <w:t>No</w:t>
             </w:r>
@@ -4386,7 +4451,7 @@
             <w:r>
               <w:rPr>
                 <w:rFonts w:ascii="Arial" w:hAnsi="Arial"/>
-                <w:sz w:val="16"/>
+                <w:sz w:val="18"/>
               </w:rPr>
               <w:t>In production</w:t>
             </w:r>
@@ -4412,7 +4477,7 @@
             <w:r>
               <w:rPr>
                 <w:rFonts w:ascii="Arial" w:hAnsi="Arial"/>
-                <w:sz w:val="16"/>
+                <w:sz w:val="18"/>
               </w:rPr>
               <w:t>AIS-004</w:t>
             </w:r>
@@ -4436,7 +4501,7 @@
             <w:r>
               <w:rPr>
                 <w:rFonts w:ascii="Arial" w:hAnsi="Arial"/>
-                <w:sz w:val="16"/>
+                <w:sz w:val="18"/>
               </w:rPr>
               <w:t>Code assistant (IDE plugin)</w:t>
             </w:r>
@@ -4460,7 +4525,7 @@
             <w:r>
               <w:rPr>
                 <w:rFonts w:ascii="Arial" w:hAnsi="Arial"/>
-                <w:sz w:val="16"/>
+                <w:sz w:val="18"/>
               </w:rPr>
               <w:t>[VENDOR]</w:t>
             </w:r>
@@ -4484,7 +4549,7 @@
             <w:r>
               <w:rPr>
                 <w:rFonts w:ascii="Arial" w:hAnsi="Arial"/>
-                <w:sz w:val="16"/>
+                <w:sz w:val="18"/>
               </w:rPr>
               <w:t>[ENG LEAD]</w:t>
             </w:r>
@@ -4508,7 +4573,7 @@
             <w:r>
               <w:rPr>
                 <w:rFonts w:ascii="Arial" w:hAnsi="Arial"/>
-                <w:sz w:val="16"/>
+                <w:sz w:val="18"/>
               </w:rPr>
               <w:t>Tier 2</w:t>
             </w:r>
@@ -4532,7 +4597,7 @@
             <w:r>
               <w:rPr>
                 <w:rFonts w:ascii="Arial" w:hAnsi="Arial"/>
-                <w:sz w:val="16"/>
+                <w:sz w:val="18"/>
               </w:rPr>
               <w:t>Minimal-risk</w:t>
             </w:r>
@@ -4556,7 +4621,7 @@
             <w:r>
               <w:rPr>
                 <w:rFonts w:ascii="Arial" w:hAnsi="Arial"/>
-                <w:sz w:val="16"/>
+                <w:sz w:val="18"/>
               </w:rPr>
               <w:t>No</w:t>
             </w:r>
@@ -4580,7 +4645,7 @@
             <w:r>
               <w:rPr>
                 <w:rFonts w:ascii="Arial" w:hAnsi="Arial"/>
-                <w:sz w:val="16"/>
+                <w:sz w:val="18"/>
               </w:rPr>
               <w:t>In production</w:t>
             </w:r>
@@ -4606,7 +4671,7 @@
             <w:r>
               <w:rPr>
                 <w:rFonts w:ascii="Arial" w:hAnsi="Arial"/>
-                <w:sz w:val="16"/>
+                <w:sz w:val="18"/>
               </w:rPr>
               <w:t>AIS-005</w:t>
             </w:r>
@@ -4630,7 +4695,7 @@
             <w:r>
               <w:rPr>
                 <w:rFonts w:ascii="Arial" w:hAnsi="Arial"/>
-                <w:sz w:val="16"/>
+                <w:sz w:val="18"/>
               </w:rPr>
               <w:t>Meeting transcription</w:t>
             </w:r>
@@ -4654,7 +4719,7 @@
             <w:r>
               <w:rPr>
                 <w:rFonts w:ascii="Arial" w:hAnsi="Arial"/>
-                <w:sz w:val="16"/>
+                <w:sz w:val="18"/>
               </w:rPr>
               <w:t>[VENDOR]</w:t>
             </w:r>
@@ -4678,7 +4743,7 @@
             <w:r>
               <w:rPr>
                 <w:rFonts w:ascii="Arial" w:hAnsi="Arial"/>
-                <w:sz w:val="16"/>
+                <w:sz w:val="18"/>
               </w:rPr>
               <w:t>[OPS LEAD]</w:t>
             </w:r>
@@ -4702,7 +4767,7 @@
             <w:r>
               <w:rPr>
                 <w:rFonts w:ascii="Arial" w:hAnsi="Arial"/>
-                <w:sz w:val="16"/>
+                <w:sz w:val="18"/>
               </w:rPr>
               <w:t>Tier 2</w:t>
             </w:r>
@@ -4726,7 +4791,7 @@
             <w:r>
               <w:rPr>
                 <w:rFonts w:ascii="Arial" w:hAnsi="Arial"/>
-                <w:sz w:val="16"/>
+                <w:sz w:val="18"/>
               </w:rPr>
               <w:t>Limited-risk</w:t>
             </w:r>
@@ -4750,7 +4815,7 @@
             <w:r>
               <w:rPr>
                 <w:rFonts w:ascii="Arial" w:hAnsi="Arial"/>
-                <w:sz w:val="16"/>
+                <w:sz w:val="18"/>
               </w:rPr>
               <w:t>No</w:t>
             </w:r>
@@ -4774,7 +4839,7 @@
             <w:r>
               <w:rPr>
                 <w:rFonts w:ascii="Arial" w:hAnsi="Arial"/>
-                <w:sz w:val="16"/>
+                <w:sz w:val="18"/>
               </w:rPr>
               <w:t>In production</w:t>
             </w:r>
@@ -4783,12 +4848,6 @@
       </w:tr>
     </w:tbl>
     <w:p/>
-    <w:p>
-      <w:pPr>
-        <w:spacing w:before="60" w:after="60"/>
-      </w:pPr>
-      <w:r/>
-    </w:p>
     <w:p>
       <w:pPr>
         <w:pStyle w:val="Heading2"/>
@@ -4802,6 +4861,7 @@
         <w:pStyle w:val="ListBullet"/>
       </w:pPr>
       <w:r>
+        <w:rPr/>
         <w:t>Are there any new systems in use that aren't in the inventory?</w:t>
       </w:r>
     </w:p>
@@ -4810,6 +4870,7 @@
         <w:pStyle w:val="ListBullet"/>
       </w:pPr>
       <w:r>
+        <w:rPr/>
         <w:t>Have any systems been retired? Move them to "Retired" but retain the record.</w:t>
       </w:r>
     </w:p>
@@ -4818,6 +4879,7 @@
         <w:pStyle w:val="ListBullet"/>
       </w:pPr>
       <w:r>
+        <w:rPr/>
         <w:t>Has any system's use case changed in a way that changes its tier?</w:t>
       </w:r>
     </w:p>
@@ -4826,6 +4888,7 @@
         <w:pStyle w:val="ListBullet"/>
       </w:pPr>
       <w:r>
+        <w:rPr/>
         <w:t>Are impact assessments current?</w:t>
       </w:r>
     </w:p>
@@ -4834,6 +4897,7 @@
         <w:pStyle w:val="ListBullet"/>
       </w:pPr>
       <w:r>
+        <w:rPr/>
         <w:t>Are DPAs, BAAs, SCCs still on file and current?</w:t>
       </w:r>
     </w:p>
@@ -4842,19 +4906,15 @@
         <w:pStyle w:val="ListBullet"/>
       </w:pPr>
       <w:r>
+        <w:rPr/>
         <w:t>Are there any open actions overdue?</w:t>
       </w:r>
     </w:p>
     <w:p>
       <w:r>
+        <w:rPr/>
         <w:t>Log the review date and any changes at the top of the sheet.</w:t>
       </w:r>
-    </w:p>
-    <w:p>
-      <w:pPr>
-        <w:spacing w:before="60" w:after="60"/>
-      </w:pPr>
-      <w:r/>
     </w:p>
     <w:p>
       <w:pPr>
@@ -4866,6 +4926,7 @@
     </w:p>
     <w:p>
       <w:r>
+        <w:rPr/>
         <w:t>This document is a template for educational and informational purposes only. It is not legal advice and does not create an attorney-client relationship. Consult qualified legal counsel before relying on this template for compliance.</w:t>
       </w:r>
     </w:p>

</xml_diff>